<commit_message>
Add selected GitHub links to portfolio and resume
</commit_message>
<xml_diff>
--- a/许库兰_医学AI实习简历.docx
+++ b/许库兰_医学AI实习简历.docx
@@ -859,8 +859,121 @@
         <w:t>AI 科研助理、民族药研究助理、生命科学数据或医疗 AI 产品实习；可承担文献与证据整理、项目资料结构化、原型迭代和模型输出复核。本科在读可参加，有薪优先，远程或武汉线下均可。</w:t>
       </w:r>
     </w:p>
+    <w:p>
+      <w:pPr>
+        <w:spacing w:before="120" w:after="40"/>
+        <w:pBdr>
+          <w:bottom w:val="single" w:sz="5" w:space="2" w:color="D9E1EA"/>
+        </w:pBdr>
+      </w:pPr>
+      <w:r>
+        <w:rPr>
+          <w:rFonts w:ascii="Arial Unicode MS" w:hAnsi="Arial Unicode MS" w:eastAsia="Arial Unicode MS" w:cs="Arial Unicode MS"/>
+          <w:b/>
+          <w:color w:val="3E7978"/>
+          <w:sz w:val="24"/>
+        </w:rPr>
+        <w:t>GitHub｜精选仓库</w:t>
+      </w:r>
+    </w:p>
+    <w:p>
+      <w:pPr>
+        <w:spacing w:after="20"/>
+      </w:pPr>
+      <w:r>
+        <w:rPr>
+          <w:rFonts w:ascii="Arial Unicode MS" w:hAnsi="Arial Unicode MS" w:eastAsia="Arial Unicode MS" w:cs="Arial Unicode MS"/>
+          <w:b/>
+          <w:color w:val="3E7978"/>
+          <w:sz w:val="19"/>
+        </w:rPr>
+        <w:t>个人主页：</w:t>
+      </w:r>
+      <w:hyperlink r:id="rId9">
+        <w:r>
+          <w:rPr>
+            <w:rFonts w:ascii="Arial Unicode MS" w:hAnsi="Arial Unicode MS" w:eastAsia="Arial Unicode MS" w:cs="Arial Unicode MS"/>
+            <w:color w:val="203C67"/>
+            <w:u w:val="single"/>
+          </w:rPr>
+          <w:t>github.com/xkrn321</w:t>
+        </w:r>
+      </w:hyperlink>
+      <w:r>
+        <w:rPr>
+          <w:rFonts w:ascii="Arial Unicode MS" w:hAnsi="Arial Unicode MS" w:eastAsia="Arial Unicode MS" w:cs="Arial Unicode MS"/>
+          <w:b/>
+          <w:color w:val="3E7978"/>
+          <w:sz w:val="19"/>
+        </w:rPr>
+        <w:t xml:space="preserve">　研究代码：</w:t>
+      </w:r>
+      <w:hyperlink r:id="rId10">
+        <w:r>
+          <w:rPr>
+            <w:rFonts w:ascii="Arial Unicode MS" w:hAnsi="Arial Unicode MS" w:eastAsia="Arial Unicode MS" w:cs="Arial Unicode MS"/>
+            <w:color w:val="203C67"/>
+            <w:u w:val="single"/>
+          </w:rPr>
+          <w:t>EthnoEvidence-Temporal-Audit</w:t>
+        </w:r>
+      </w:hyperlink>
+    </w:p>
+    <w:p>
+      <w:pPr>
+        <w:spacing w:after="20"/>
+      </w:pPr>
+      <w:hyperlink r:id="rId11">
+        <w:r>
+          <w:rPr>
+            <w:rFonts w:ascii="Arial Unicode MS" w:hAnsi="Arial Unicode MS" w:eastAsia="Arial Unicode MS" w:cs="Arial Unicode MS"/>
+            <w:color w:val="203C67"/>
+            <w:u w:val="single"/>
+          </w:rPr>
+          <w:t>ethno-profiler</w:t>
+        </w:r>
+      </w:hyperlink>
+      <w:r>
+        <w:rPr>
+          <w:rFonts w:ascii="Arial Unicode MS" w:hAnsi="Arial Unicode MS" w:eastAsia="Arial Unicode MS" w:cs="Arial Unicode MS"/>
+          <w:b/>
+          <w:color w:val="3E7978"/>
+          <w:sz w:val="19"/>
+        </w:rPr>
+        <w:t xml:space="preserve">　作品与交互：</w:t>
+      </w:r>
+      <w:hyperlink r:id="rId12">
+        <w:r>
+          <w:rPr>
+            <w:rFonts w:ascii="Arial Unicode MS" w:hAnsi="Arial Unicode MS" w:eastAsia="Arial Unicode MS" w:cs="Arial Unicode MS"/>
+            <w:color w:val="203C67"/>
+            <w:u w:val="single"/>
+          </w:rPr>
+          <w:t>medical-ai-portfolio</w:t>
+        </w:r>
+      </w:hyperlink>
+      <w:r>
+        <w:rPr>
+          <w:rFonts w:ascii="Arial Unicode MS" w:hAnsi="Arial Unicode MS" w:eastAsia="Arial Unicode MS" w:cs="Arial Unicode MS"/>
+          <w:b w:val="0"/>
+          <w:color w:val="34445A"/>
+          <w:sz w:val="19"/>
+        </w:rPr>
+        <w:t xml:space="preserve">　</w:t>
+      </w:r>
+      <w:hyperlink r:id="rId13">
+        <w:r>
+          <w:rPr>
+            <w:rFonts w:ascii="Arial Unicode MS" w:hAnsi="Arial Unicode MS" w:eastAsia="Arial Unicode MS" w:cs="Arial Unicode MS"/>
+            <w:color w:val="203C67"/>
+            <w:u w:val="single"/>
+          </w:rPr>
+          <w:t>huangjing-3d</w:t>
+        </w:r>
+      </w:hyperlink>
+    </w:p>
     <w:sectPr>
-      <w:footerReference w:type="default" r:id="rId9"/>
+      <w:footerReference w:type="default" r:id="rId14"/>
       <w:pgSz w:w="11909" w:h="16834"/>
       <w:pgMar w:top="605" w:right="835" w:bottom="576" w:left="835" w:header="288" w:footer="288" w:gutter="0"/>
       <w:cols w:space="720"/>

</xml_diff>